<commit_message>
Added firebase, user creation, and basic mastery system
</commit_message>
<xml_diff>
--- a/Listening practice ideas.docx
+++ b/Listening practice ideas.docx
@@ -53,6 +53,127 @@
       <w:proofErr w:type="spellEnd"/>
       <w:r>
         <w:t xml:space="preserve"> (up to phrases)-&gt; paraphrase transcript but keep key phrases -&gt; note taking</w:t>
+      </w:r>
+    </w:p>
+    <w:p>
+      <w:pPr>
+        <w:pStyle w:val="ListParagraph"/>
+        <w:numPr>
+          <w:ilvl w:val="0"/>
+          <w:numId w:val="1"/>
+        </w:numPr>
+      </w:pPr>
+      <w:r>
+        <w:t>Adaptive mode: if user misses many words, next sentence will play in shorter chunks.</w:t>
+      </w:r>
+    </w:p>
+    <w:p>
+      <w:pPr>
+        <w:pStyle w:val="ListParagraph"/>
+        <w:numPr>
+          <w:ilvl w:val="0"/>
+          <w:numId w:val="1"/>
+        </w:numPr>
+      </w:pPr>
+      <w:r>
+        <w:t>Track frequently missed words</w:t>
+      </w:r>
+    </w:p>
+    <w:p>
+      <w:pPr>
+        <w:pStyle w:val="ListParagraph"/>
+        <w:numPr>
+          <w:ilvl w:val="0"/>
+          <w:numId w:val="1"/>
+        </w:numPr>
+      </w:pPr>
+      <w:r>
+        <w:drawing>
+          <wp:inline distT="0" distB="0" distL="0" distR="0" wp14:anchorId="6A2487E0" wp14:editId="0418E0BF">
+            <wp:extent cx="2471738" cy="1544572"/>
+            <wp:effectExtent l="0" t="0" r="5080" b="0"/>
+            <wp:docPr id="1954812567" name="Picture 1"/>
+            <wp:cNvGraphicFramePr>
+              <a:graphicFrameLocks xmlns:a="http://schemas.openxmlformats.org/drawingml/2006/main" noChangeAspect="1"/>
+            </wp:cNvGraphicFramePr>
+            <a:graphic xmlns:a="http://schemas.openxmlformats.org/drawingml/2006/main">
+              <a:graphicData uri="http://schemas.openxmlformats.org/drawingml/2006/picture">
+                <pic:pic xmlns:pic="http://schemas.openxmlformats.org/drawingml/2006/picture">
+                  <pic:nvPicPr>
+                    <pic:cNvPr id="1954812567" name=""/>
+                    <pic:cNvPicPr/>
+                  </pic:nvPicPr>
+                  <pic:blipFill>
+                    <a:blip r:embed="rId5"/>
+                    <a:stretch>
+                      <a:fillRect/>
+                    </a:stretch>
+                  </pic:blipFill>
+                  <pic:spPr>
+                    <a:xfrm>
+                      <a:off x="0" y="0"/>
+                      <a:ext cx="2477319" cy="1548060"/>
+                    </a:xfrm>
+                    <a:prstGeom prst="rect">
+                      <a:avLst/>
+                    </a:prstGeom>
+                  </pic:spPr>
+                </pic:pic>
+              </a:graphicData>
+            </a:graphic>
+          </wp:inline>
+        </w:drawing>
+      </w:r>
+    </w:p>
+    <w:p>
+      <w:pPr>
+        <w:pStyle w:val="ListParagraph"/>
+      </w:pPr>
+    </w:p>
+    <w:p>
+      <w:pPr>
+        <w:pStyle w:val="ListParagraph"/>
+        <w:numPr>
+          <w:ilvl w:val="0"/>
+          <w:numId w:val="1"/>
+        </w:numPr>
+      </w:pPr>
+      <w:r>
+        <w:drawing>
+          <wp:inline distT="0" distB="0" distL="0" distR="0" wp14:anchorId="32E13DC1" wp14:editId="3BE92512">
+            <wp:extent cx="2791905" cy="2028825"/>
+            <wp:effectExtent l="0" t="0" r="8890" b="0"/>
+            <wp:docPr id="1271087696" name="Picture 1"/>
+            <wp:cNvGraphicFramePr>
+              <a:graphicFrameLocks xmlns:a="http://schemas.openxmlformats.org/drawingml/2006/main" noChangeAspect="1"/>
+            </wp:cNvGraphicFramePr>
+            <a:graphic xmlns:a="http://schemas.openxmlformats.org/drawingml/2006/main">
+              <a:graphicData uri="http://schemas.openxmlformats.org/drawingml/2006/picture">
+                <pic:pic xmlns:pic="http://schemas.openxmlformats.org/drawingml/2006/picture">
+                  <pic:nvPicPr>
+                    <pic:cNvPr id="1271087696" name=""/>
+                    <pic:cNvPicPr/>
+                  </pic:nvPicPr>
+                  <pic:blipFill>
+                    <a:blip r:embed="rId6"/>
+                    <a:stretch>
+                      <a:fillRect/>
+                    </a:stretch>
+                  </pic:blipFill>
+                  <pic:spPr>
+                    <a:xfrm>
+                      <a:off x="0" y="0"/>
+                      <a:ext cx="2794308" cy="2030571"/>
+                    </a:xfrm>
+                    <a:prstGeom prst="rect">
+                      <a:avLst/>
+                    </a:prstGeom>
+                  </pic:spPr>
+                </pic:pic>
+              </a:graphicData>
+            </a:graphic>
+          </wp:inline>
+        </w:drawing>
       </w:r>
     </w:p>
     <w:sectPr>

</xml_diff>

<commit_message>
Fixed UI bug + Progression mode
</commit_message>
<xml_diff>
--- a/Listening practice ideas.docx
+++ b/Listening practice ideas.docx
@@ -16,15 +16,7 @@
         </w:numPr>
       </w:pPr>
       <w:r>
-        <w:t xml:space="preserve">Insert </w:t>
-      </w:r>
-      <w:proofErr w:type="spellStart"/>
-      <w:r>
-        <w:t>utube</w:t>
-      </w:r>
-      <w:proofErr w:type="spellEnd"/>
-      <w:r>
-        <w:t xml:space="preserve"> vid -&gt; live transcription -&gt; dictation</w:t>
+        <w:t>Insert utube vid -&gt; live transcription -&gt; dictation</w:t>
       </w:r>
     </w:p>
     <w:p>
@@ -36,23 +28,7 @@
         </w:numPr>
       </w:pPr>
       <w:r>
-        <w:t xml:space="preserve">Transcript -&gt; hide transcript + play audio -&gt; </w:t>
-      </w:r>
-      <w:proofErr w:type="spellStart"/>
-      <w:r>
-        <w:t>lfib</w:t>
-      </w:r>
-      <w:proofErr w:type="spellEnd"/>
-      <w:r>
-        <w:t xml:space="preserve"> / </w:t>
-      </w:r>
-      <w:proofErr w:type="spellStart"/>
-      <w:r>
-        <w:t>hiw</w:t>
-      </w:r>
-      <w:proofErr w:type="spellEnd"/>
-      <w:r>
-        <w:t xml:space="preserve"> (up to phrases)-&gt; paraphrase transcript but keep key phrases -&gt; note taking</w:t>
+        <w:t>Transcript -&gt; hide transcript + play audio -&gt; lfib / hiw (up to phrases)-&gt; paraphrase transcript but keep key phrases -&gt; note taking</w:t>
       </w:r>
     </w:p>
     <w:p>
@@ -176,6 +152,149 @@
         </w:drawing>
       </w:r>
     </w:p>
+    <w:p>
+      <w:pPr>
+        <w:pStyle w:val="ListParagraph"/>
+      </w:pPr>
+    </w:p>
+    <w:p>
+      <w:pPr>
+        <w:pStyle w:val="ListParagraph"/>
+        <w:numPr>
+          <w:ilvl w:val="0"/>
+          <w:numId w:val="1"/>
+        </w:numPr>
+      </w:pPr>
+      <w:r>
+        <w:drawing>
+          <wp:inline distT="0" distB="0" distL="0" distR="0" wp14:anchorId="352A839B" wp14:editId="605853F9">
+            <wp:extent cx="3121228" cy="1419225"/>
+            <wp:effectExtent l="0" t="0" r="3175" b="0"/>
+            <wp:docPr id="1460221517" name="Picture 1"/>
+            <wp:cNvGraphicFramePr>
+              <a:graphicFrameLocks xmlns:a="http://schemas.openxmlformats.org/drawingml/2006/main" noChangeAspect="1"/>
+            </wp:cNvGraphicFramePr>
+            <a:graphic xmlns:a="http://schemas.openxmlformats.org/drawingml/2006/main">
+              <a:graphicData uri="http://schemas.openxmlformats.org/drawingml/2006/picture">
+                <pic:pic xmlns:pic="http://schemas.openxmlformats.org/drawingml/2006/picture">
+                  <pic:nvPicPr>
+                    <pic:cNvPr id="1460221517" name=""/>
+                    <pic:cNvPicPr/>
+                  </pic:nvPicPr>
+                  <pic:blipFill>
+                    <a:blip r:embed="rId7"/>
+                    <a:stretch>
+                      <a:fillRect/>
+                    </a:stretch>
+                  </pic:blipFill>
+                  <pic:spPr>
+                    <a:xfrm>
+                      <a:off x="0" y="0"/>
+                      <a:ext cx="3124482" cy="1420705"/>
+                    </a:xfrm>
+                    <a:prstGeom prst="rect">
+                      <a:avLst/>
+                    </a:prstGeom>
+                  </pic:spPr>
+                </pic:pic>
+              </a:graphicData>
+            </a:graphic>
+          </wp:inline>
+        </w:drawing>
+      </w:r>
+    </w:p>
+    <w:p>
+      <w:pPr>
+        <w:pStyle w:val="ListParagraph"/>
+      </w:pPr>
+    </w:p>
+    <w:p>
+      <w:pPr>
+        <w:pStyle w:val="ListParagraph"/>
+        <w:numPr>
+          <w:ilvl w:val="0"/>
+          <w:numId w:val="1"/>
+        </w:numPr>
+      </w:pPr>
+      <w:r>
+        <w:t>Shadowing mode -&gt; speak + listen cùng lúc</w:t>
+      </w:r>
+    </w:p>
+    <w:p>
+      <w:r>
+        <w:br w:type="page"/>
+      </w:r>
+    </w:p>
+    <w:p>
+      <w:pPr>
+        <w:pStyle w:val="ListParagraph"/>
+        <w:numPr>
+          <w:ilvl w:val="0"/>
+          <w:numId w:val="1"/>
+        </w:numPr>
+      </w:pPr>
+      <w:r>
+        <w:lastRenderedPageBreak/>
+        <w:drawing>
+          <wp:inline distT="0" distB="0" distL="0" distR="0" wp14:anchorId="00EB9D53" wp14:editId="66D6566D">
+            <wp:extent cx="5943600" cy="2478405"/>
+            <wp:effectExtent l="0" t="0" r="0" b="0"/>
+            <wp:docPr id="118931593" name="Picture 1"/>
+            <wp:cNvGraphicFramePr>
+              <a:graphicFrameLocks xmlns:a="http://schemas.openxmlformats.org/drawingml/2006/main" noChangeAspect="1"/>
+            </wp:cNvGraphicFramePr>
+            <a:graphic xmlns:a="http://schemas.openxmlformats.org/drawingml/2006/main">
+              <a:graphicData uri="http://schemas.openxmlformats.org/drawingml/2006/picture">
+                <pic:pic xmlns:pic="http://schemas.openxmlformats.org/drawingml/2006/picture">
+                  <pic:nvPicPr>
+                    <pic:cNvPr id="118931593" name=""/>
+                    <pic:cNvPicPr/>
+                  </pic:nvPicPr>
+                  <pic:blipFill>
+                    <a:blip r:embed="rId8"/>
+                    <a:stretch>
+                      <a:fillRect/>
+                    </a:stretch>
+                  </pic:blipFill>
+                  <pic:spPr>
+                    <a:xfrm>
+                      <a:off x="0" y="0"/>
+                      <a:ext cx="5943600" cy="2478405"/>
+                    </a:xfrm>
+                    <a:prstGeom prst="rect">
+                      <a:avLst/>
+                    </a:prstGeom>
+                  </pic:spPr>
+                </pic:pic>
+              </a:graphicData>
+            </a:graphic>
+          </wp:inline>
+        </w:drawing>
+      </w:r>
+    </w:p>
+    <w:p>
+      <w:r>
+        <w:br w:type="page"/>
+      </w:r>
+    </w:p>
+    <w:p>
+      <w:r>
+        <w:lastRenderedPageBreak/>
+        <w:t>RA:</w:t>
+      </w:r>
+    </w:p>
+    <w:p>
+      <w:pPr>
+        <w:pStyle w:val="ListParagraph"/>
+        <w:numPr>
+          <w:ilvl w:val="0"/>
+          <w:numId w:val="2"/>
+        </w:numPr>
+      </w:pPr>
+      <w:r>
+        <w:t>Break into single sentences -&gt; practice</w:t>
+      </w:r>
+    </w:p>
     <w:sectPr>
       <w:pgSz w:w="12240" w:h="15840"/>
       <w:pgMar w:top="1440" w:right="1440" w:bottom="1440" w:left="1440" w:header="720" w:footer="720" w:gutter="0"/>
@@ -277,8 +396,100 @@
       </w:pPr>
     </w:lvl>
   </w:abstractNum>
+  <w:abstractNum w:abstractNumId="1" w15:restartNumberingAfterBreak="0">
+    <w:nsid w:val="6E7B28CD"/>
+    <w:multiLevelType w:val="hybridMultilevel"/>
+    <w:tmpl w:val="78446EE6"/>
+    <w:lvl w:ilvl="0" w:tplc="0409000F">
+      <w:start w:val="1"/>
+      <w:numFmt w:val="decimal"/>
+      <w:lvlText w:val="%1."/>
+      <w:lvlJc w:val="left"/>
+      <w:pPr>
+        <w:ind w:left="720" w:hanging="360"/>
+      </w:pPr>
+      <w:rPr>
+        <w:rFonts w:hint="default"/>
+      </w:rPr>
+    </w:lvl>
+    <w:lvl w:ilvl="1" w:tplc="04090019" w:tentative="1">
+      <w:start w:val="1"/>
+      <w:numFmt w:val="lowerLetter"/>
+      <w:lvlText w:val="%2."/>
+      <w:lvlJc w:val="left"/>
+      <w:pPr>
+        <w:ind w:left="1440" w:hanging="360"/>
+      </w:pPr>
+    </w:lvl>
+    <w:lvl w:ilvl="2" w:tplc="0409001B" w:tentative="1">
+      <w:start w:val="1"/>
+      <w:numFmt w:val="lowerRoman"/>
+      <w:lvlText w:val="%3."/>
+      <w:lvlJc w:val="right"/>
+      <w:pPr>
+        <w:ind w:left="2160" w:hanging="180"/>
+      </w:pPr>
+    </w:lvl>
+    <w:lvl w:ilvl="3" w:tplc="0409000F" w:tentative="1">
+      <w:start w:val="1"/>
+      <w:numFmt w:val="decimal"/>
+      <w:lvlText w:val="%4."/>
+      <w:lvlJc w:val="left"/>
+      <w:pPr>
+        <w:ind w:left="2880" w:hanging="360"/>
+      </w:pPr>
+    </w:lvl>
+    <w:lvl w:ilvl="4" w:tplc="04090019" w:tentative="1">
+      <w:start w:val="1"/>
+      <w:numFmt w:val="lowerLetter"/>
+      <w:lvlText w:val="%5."/>
+      <w:lvlJc w:val="left"/>
+      <w:pPr>
+        <w:ind w:left="3600" w:hanging="360"/>
+      </w:pPr>
+    </w:lvl>
+    <w:lvl w:ilvl="5" w:tplc="0409001B" w:tentative="1">
+      <w:start w:val="1"/>
+      <w:numFmt w:val="lowerRoman"/>
+      <w:lvlText w:val="%6."/>
+      <w:lvlJc w:val="right"/>
+      <w:pPr>
+        <w:ind w:left="4320" w:hanging="180"/>
+      </w:pPr>
+    </w:lvl>
+    <w:lvl w:ilvl="6" w:tplc="0409000F" w:tentative="1">
+      <w:start w:val="1"/>
+      <w:numFmt w:val="decimal"/>
+      <w:lvlText w:val="%7."/>
+      <w:lvlJc w:val="left"/>
+      <w:pPr>
+        <w:ind w:left="5040" w:hanging="360"/>
+      </w:pPr>
+    </w:lvl>
+    <w:lvl w:ilvl="7" w:tplc="04090019" w:tentative="1">
+      <w:start w:val="1"/>
+      <w:numFmt w:val="lowerLetter"/>
+      <w:lvlText w:val="%8."/>
+      <w:lvlJc w:val="left"/>
+      <w:pPr>
+        <w:ind w:left="5760" w:hanging="360"/>
+      </w:pPr>
+    </w:lvl>
+    <w:lvl w:ilvl="8" w:tplc="0409001B" w:tentative="1">
+      <w:start w:val="1"/>
+      <w:numFmt w:val="lowerRoman"/>
+      <w:lvlText w:val="%9."/>
+      <w:lvlJc w:val="right"/>
+      <w:pPr>
+        <w:ind w:left="6480" w:hanging="180"/>
+      </w:pPr>
+    </w:lvl>
+  </w:abstractNum>
   <w:num w:numId="1" w16cid:durableId="379088678">
     <w:abstractNumId w:val="0"/>
+  </w:num>
+  <w:num w:numId="2" w16cid:durableId="1644122675">
+    <w:abstractNumId w:val="1"/>
   </w:num>
 </w:numbering>
 </file>

</xml_diff>